<commit_message>
Update resume to optimized 0812 version (PDF + protected docx)
</commit_message>
<xml_diff>
--- a/public/guangze-resume.docx
+++ b/public/guangze-resume.docx
@@ -63,6 +63,8 @@
               <w:spacing w:before="170" w:after="25" w:line="500" w:lineRule="atLeast"/>
               <w:ind w:firstLine="440" w:firstLineChars="100"/>
             </w:pPr>
+            <w:bookmarkStart w:id="0" w:name="_GoBack"/>
+            <w:bookmarkEnd w:id="0"/>
             <w:r>
               <w:rPr>
                 <w:rFonts w:ascii="微软雅黑" w:hAnsi="微软雅黑" w:eastAsia="微软雅黑" w:cs="微软雅黑"/>
@@ -271,8 +273,6 @@
         </w:rPr>
         <w:t>Target Direction</w:t>
       </w:r>
-      <w:bookmarkStart w:id="0" w:name="_GoBack"/>
-      <w:bookmarkEnd w:id="0"/>
     </w:p>
     <w:p>
       <w:pPr>
@@ -465,6 +465,14 @@
           <w:szCs w:val="16"/>
         </w:rPr>
         <w:tab/>
+      </w:r>
+      <w:r>
+        <w:rPr>
+          <w:rFonts w:ascii="微软雅黑" w:hAnsi="微软雅黑" w:eastAsia="微软雅黑" w:cs="微软雅黑"/>
+          <w:color w:val="6B8599"/>
+          <w:sz w:val="16"/>
+          <w:szCs w:val="16"/>
+        </w:rPr>
         <w:t>2026.09–至今</w:t>
       </w:r>
     </w:p>
@@ -530,6 +538,14 @@
           <w:szCs w:val="16"/>
         </w:rPr>
         <w:tab/>
+      </w:r>
+      <w:r>
+        <w:rPr>
+          <w:rFonts w:ascii="微软雅黑" w:hAnsi="微软雅黑" w:eastAsia="微软雅黑" w:cs="微软雅黑"/>
+          <w:color w:val="6B8599"/>
+          <w:sz w:val="16"/>
+          <w:szCs w:val="16"/>
+        </w:rPr>
         <w:t>2024.09–2025.09</w:t>
       </w:r>
     </w:p>
@@ -595,6 +611,14 @@
           <w:szCs w:val="16"/>
         </w:rPr>
         <w:tab/>
+      </w:r>
+      <w:r>
+        <w:rPr>
+          <w:rFonts w:ascii="微软雅黑" w:hAnsi="微软雅黑" w:eastAsia="微软雅黑" w:cs="微软雅黑"/>
+          <w:color w:val="6B8599"/>
+          <w:sz w:val="16"/>
+          <w:szCs w:val="16"/>
+        </w:rPr>
         <w:t>2021.07–2024.07</w:t>
       </w:r>
     </w:p>
@@ -689,6 +713,14 @@
           <w:szCs w:val="16"/>
         </w:rPr>
         <w:tab/>
+      </w:r>
+      <w:r>
+        <w:rPr>
+          <w:rFonts w:ascii="微软雅黑" w:hAnsi="微软雅黑" w:eastAsia="微软雅黑" w:cs="微软雅黑"/>
+          <w:color w:val="6B8599"/>
+          <w:sz w:val="16"/>
+          <w:szCs w:val="16"/>
+        </w:rPr>
         <w:t>2026.04–至今</w:t>
       </w:r>
     </w:p>
@@ -804,6 +836,14 @@
           <w:szCs w:val="16"/>
         </w:rPr>
         <w:tab/>
+      </w:r>
+      <w:r>
+        <w:rPr>
+          <w:rFonts w:ascii="微软雅黑" w:hAnsi="微软雅黑" w:eastAsia="微软雅黑" w:cs="微软雅黑"/>
+          <w:color w:val="6B8599"/>
+          <w:sz w:val="16"/>
+          <w:szCs w:val="16"/>
+        </w:rPr>
         <w:t>2026.04.03–2026.04.13</w:t>
       </w:r>
     </w:p>
@@ -894,6 +934,14 @@
           <w:szCs w:val="16"/>
         </w:rPr>
         <w:tab/>
+      </w:r>
+      <w:r>
+        <w:rPr>
+          <w:rFonts w:ascii="微软雅黑" w:hAnsi="微软雅黑" w:eastAsia="微软雅黑" w:cs="微软雅黑"/>
+          <w:color w:val="6B8599"/>
+          <w:sz w:val="16"/>
+          <w:szCs w:val="16"/>
+        </w:rPr>
         <w:t>2025.10–至今</w:t>
       </w:r>
     </w:p>
@@ -1009,6 +1057,14 @@
           <w:szCs w:val="16"/>
         </w:rPr>
         <w:tab/>
+      </w:r>
+      <w:r>
+        <w:rPr>
+          <w:rFonts w:ascii="微软雅黑" w:hAnsi="微软雅黑" w:eastAsia="微软雅黑" w:cs="微软雅黑"/>
+          <w:color w:val="6B8599"/>
+          <w:sz w:val="16"/>
+          <w:szCs w:val="16"/>
+        </w:rPr>
         <w:t>2024.06–2024.08</w:t>
       </w:r>
     </w:p>
@@ -1124,6 +1180,14 @@
           <w:szCs w:val="16"/>
         </w:rPr>
         <w:tab/>
+      </w:r>
+      <w:r>
+        <w:rPr>
+          <w:rFonts w:ascii="微软雅黑" w:hAnsi="微软雅黑" w:eastAsia="微软雅黑" w:cs="微软雅黑"/>
+          <w:color w:val="6B8599"/>
+          <w:sz w:val="16"/>
+          <w:szCs w:val="16"/>
+        </w:rPr>
         <w:t>2024.07–2025.08</w:t>
       </w:r>
     </w:p>
@@ -1214,6 +1278,14 @@
           <w:szCs w:val="16"/>
         </w:rPr>
         <w:tab/>
+      </w:r>
+      <w:r>
+        <w:rPr>
+          <w:rFonts w:ascii="微软雅黑" w:hAnsi="微软雅黑" w:eastAsia="微软雅黑" w:cs="微软雅黑"/>
+          <w:color w:val="6B8599"/>
+          <w:sz w:val="16"/>
+          <w:szCs w:val="16"/>
+        </w:rPr>
         <w:t>2023.08–2023.09</w:t>
       </w:r>
     </w:p>
@@ -1339,6 +1411,14 @@
           <w:szCs w:val="16"/>
         </w:rPr>
         <w:tab/>
+      </w:r>
+      <w:r>
+        <w:rPr>
+          <w:rFonts w:ascii="微软雅黑" w:hAnsi="微软雅黑" w:eastAsia="微软雅黑" w:cs="微软雅黑"/>
+          <w:color w:val="6B8599"/>
+          <w:sz w:val="16"/>
+          <w:szCs w:val="16"/>
+        </w:rPr>
         <w:t>2023.06–2023.09</w:t>
       </w:r>
     </w:p>
@@ -1647,6 +1727,14 @@
           <w:szCs w:val="16"/>
         </w:rPr>
         <w:tab/>
+      </w:r>
+      <w:r>
+        <w:rPr>
+          <w:rFonts w:ascii="微软雅黑" w:hAnsi="微软雅黑" w:eastAsia="微软雅黑" w:cs="微软雅黑"/>
+          <w:color w:val="6B8599"/>
+          <w:sz w:val="16"/>
+          <w:szCs w:val="16"/>
+        </w:rPr>
         <w:t>2025.08</w:t>
       </w:r>
     </w:p>
@@ -1737,6 +1825,14 @@
           <w:szCs w:val="16"/>
         </w:rPr>
         <w:tab/>
+      </w:r>
+      <w:r>
+        <w:rPr>
+          <w:rFonts w:ascii="微软雅黑" w:hAnsi="微软雅黑" w:eastAsia="微软雅黑" w:cs="微软雅黑"/>
+          <w:color w:val="6B8599"/>
+          <w:sz w:val="16"/>
+          <w:szCs w:val="16"/>
+        </w:rPr>
         <w:t>2024.08–2025.03</w:t>
       </w:r>
     </w:p>
@@ -1827,6 +1923,14 @@
           <w:szCs w:val="16"/>
         </w:rPr>
         <w:tab/>
+      </w:r>
+      <w:r>
+        <w:rPr>
+          <w:rFonts w:ascii="微软雅黑" w:hAnsi="微软雅黑" w:eastAsia="微软雅黑" w:cs="微软雅黑"/>
+          <w:color w:val="6B8599"/>
+          <w:sz w:val="16"/>
+          <w:szCs w:val="16"/>
+        </w:rPr>
         <w:t>2025.03–2025.08</w:t>
       </w:r>
     </w:p>
@@ -1917,6 +2021,14 @@
           <w:szCs w:val="16"/>
         </w:rPr>
         <w:tab/>
+      </w:r>
+      <w:r>
+        <w:rPr>
+          <w:rFonts w:ascii="微软雅黑" w:hAnsi="微软雅黑" w:eastAsia="微软雅黑" w:cs="微软雅黑"/>
+          <w:color w:val="6B8599"/>
+          <w:sz w:val="16"/>
+          <w:szCs w:val="16"/>
+        </w:rPr>
         <w:t>2025.03–2025.08</w:t>
       </w:r>
     </w:p>
@@ -2007,6 +2119,14 @@
           <w:szCs w:val="16"/>
         </w:rPr>
         <w:tab/>
+      </w:r>
+      <w:r>
+        <w:rPr>
+          <w:rFonts w:ascii="微软雅黑" w:hAnsi="微软雅黑" w:eastAsia="微软雅黑" w:cs="微软雅黑"/>
+          <w:color w:val="6B8599"/>
+          <w:sz w:val="16"/>
+          <w:szCs w:val="16"/>
+        </w:rPr>
         <w:t>2024.07–2024.08</w:t>
       </w:r>
     </w:p>
@@ -2097,6 +2217,14 @@
           <w:szCs w:val="16"/>
         </w:rPr>
         <w:tab/>
+      </w:r>
+      <w:r>
+        <w:rPr>
+          <w:rFonts w:ascii="微软雅黑" w:hAnsi="微软雅黑" w:eastAsia="微软雅黑" w:cs="微软雅黑"/>
+          <w:color w:val="6B8599"/>
+          <w:sz w:val="16"/>
+          <w:szCs w:val="16"/>
+        </w:rPr>
         <w:t>2024.01–2024.06</w:t>
       </w:r>
     </w:p>
@@ -2187,6 +2315,14 @@
           <w:szCs w:val="16"/>
         </w:rPr>
         <w:tab/>
+      </w:r>
+      <w:r>
+        <w:rPr>
+          <w:rFonts w:ascii="微软雅黑" w:hAnsi="微软雅黑" w:eastAsia="微软雅黑" w:cs="微软雅黑"/>
+          <w:color w:val="6B8599"/>
+          <w:sz w:val="16"/>
+          <w:szCs w:val="16"/>
+        </w:rPr>
         <w:t>2023.04–2024.05</w:t>
       </w:r>
     </w:p>
@@ -2475,7 +2611,7 @@
     <w:lsdException w:unhideWhenUsed="0" w:uiPriority="0" w:semiHidden="0" w:name="toc 8"/>
     <w:lsdException w:unhideWhenUsed="0" w:uiPriority="0" w:semiHidden="0" w:name="toc 9"/>
     <w:lsdException w:unhideWhenUsed="0" w:uiPriority="0" w:semiHidden="0" w:name="Normal Indent"/>
-    <w:lsdException w:uiPriority="99" w:name="footnote text"/>
+    <w:lsdException w:qFormat="1" w:uiPriority="99" w:name="footnote text"/>
     <w:lsdException w:unhideWhenUsed="0" w:uiPriority="0" w:semiHidden="0" w:name="annotation text"/>
     <w:lsdException w:unhideWhenUsed="0" w:uiPriority="0" w:semiHidden="0" w:name="header"/>
     <w:lsdException w:unhideWhenUsed="0" w:uiPriority="0" w:semiHidden="0" w:name="footer"/>
@@ -2531,7 +2667,7 @@
     <w:lsdException w:unhideWhenUsed="0" w:uiPriority="0" w:semiHidden="0" w:name="Body Text Indent 2"/>
     <w:lsdException w:unhideWhenUsed="0" w:uiPriority="0" w:semiHidden="0" w:name="Body Text Indent 3"/>
     <w:lsdException w:unhideWhenUsed="0" w:uiPriority="0" w:semiHidden="0" w:name="Block Text"/>
-    <w:lsdException w:uiPriority="99" w:semiHidden="0" w:name="Hyperlink"/>
+    <w:lsdException w:qFormat="1" w:uiPriority="99" w:semiHidden="0" w:name="Hyperlink"/>
     <w:lsdException w:unhideWhenUsed="0" w:uiPriority="0" w:semiHidden="0" w:name="FollowedHyperlink"/>
     <w:lsdException w:qFormat="1" w:unhideWhenUsed="0" w:uiPriority="0" w:semiHidden="0" w:name="Strong"/>
     <w:lsdException w:qFormat="1" w:unhideWhenUsed="0" w:uiPriority="0" w:semiHidden="0" w:name="Emphasis"/>
@@ -2827,6 +2963,7 @@
     <w:link w:val="17"/>
     <w:semiHidden/>
     <w:unhideWhenUsed/>
+    <w:qFormat/>
     <w:uiPriority w:val="99"/>
     <w:pPr>
       <w:spacing w:after="0" w:line="240" w:lineRule="auto"/>
@@ -2862,6 +2999,7 @@
   <w:style w:type="character" w:styleId="14">
     <w:name w:val="Hyperlink"/>
     <w:unhideWhenUsed/>
+    <w:qFormat/>
     <w:uiPriority w:val="99"/>
     <w:rPr>
       <w:color w:val="0563C1"/>
@@ -2894,6 +3032,7 @@
     <w:link w:val="9"/>
     <w:semiHidden/>
     <w:unhideWhenUsed/>
+    <w:qFormat/>
     <w:uiPriority w:val="99"/>
     <w:rPr>
       <w:sz w:val="20"/>

</xml_diff>

<commit_message>
Resume: add 3 CAES research projects (multi-scale cavern physical model test, abandoned mine CAES storage, Chengdu Engineering high-pressure sealing test)
</commit_message>
<xml_diff>
--- a/public/guangze-resume.docx
+++ b/public/guangze-resume.docx
@@ -1688,6 +1688,375 @@
           <w:szCs w:val="17"/>
         </w:rPr>
         <w:t>Projects</w:t>
+      </w:r>
+    </w:p>
+    <w:p>
+      <w:pPr>
+        <w:keepNext/>
+        <w:tabs>
+          <w:tab w:val="right" w:pos="10306"/>
+        </w:tabs>
+        <w:spacing w:before="34" w:after="16" w:line="230" w:lineRule="auto"/>
+        <w:ind w:left="800" w:right="800"/>
+      </w:pPr>
+      <w:r>
+        <w:rPr>
+          <w:rFonts w:ascii="微软雅黑" w:hAnsi="微软雅黑" w:eastAsia="微软雅黑" w:cs="微软雅黑"/>
+          <w:b/>
+          <w:bCs/>
+          <w:color w:val="1A2636"/>
+          <w:sz w:val="22"/>
+          <w:szCs w:val="22"/>
+        </w:rPr>
+        <w:t xml:space="preserve">多尺度洞室非连续裂缝围岩循环内压物理模型试验</w:t>
+      </w:r>
+      <w:r>
+        <w:rPr>
+          <w:rFonts w:ascii="微软雅黑" w:hAnsi="微软雅黑" w:eastAsia="微软雅黑" w:cs="微软雅黑"/>
+          <w:color w:val="2980B9"/>
+          <w:sz w:val="20"/>
+          <w:szCs w:val="20"/>
+        </w:rPr>
+        <w:t xml:space="preserve">  项目总负责人</w:t>
+      </w:r>
+      <w:r>
+        <w:rPr>
+          <w:rFonts w:ascii="微软雅黑" w:hAnsi="微软雅黑" w:eastAsia="微软雅黑" w:cs="微软雅黑"/>
+          <w:color w:val="6B8599"/>
+          <w:sz w:val="16"/>
+          <w:szCs w:val="16"/>
+        </w:rPr>
+        <w:tab/>
+      </w:r>
+      <w:r>
+        <w:rPr>
+          <w:rFonts w:ascii="微软雅黑" w:hAnsi="微软雅黑" w:eastAsia="微软雅黑" w:cs="微软雅黑"/>
+          <w:color w:val="6B8599"/>
+          <w:sz w:val="16"/>
+          <w:szCs w:val="16"/>
+        </w:rPr>
+        <w:t xml:space="preserve">2026.02–至今</w:t>
+      </w:r>
+    </w:p>
+    <w:p>
+      <w:pPr>
+        <w:keepNext w:val="0"/>
+        <w:keepLines/>
+        <w:spacing w:after="3" w:line="230" w:lineRule="auto"/>
+        <w:ind w:left="950" w:right="800" w:hanging="150"/>
+      </w:pPr>
+      <w:r>
+        <w:rPr>
+          <w:color w:val="2980B9"/>
+          <w:sz w:val="20"/>
+          <w:szCs w:val="20"/>
+        </w:rPr>
+        <w:t xml:space="preserve">•  </w:t>
+      </w:r>
+      <w:r>
+        <w:rPr>
+          <w:rFonts w:ascii="微软雅黑" w:hAnsi="微软雅黑" w:eastAsia="微软雅黑" w:cs="微软雅黑"/>
+          <w:color w:val="2C3E50"/>
+          <w:sz w:val="20"/>
+          <w:szCs w:val="20"/>
+        </w:rPr>
+        <w:t xml:space="preserve">主持构建“UPVC 主洞室—多尺度柔性小洞室—非连续预制裂缝围岩”组合试验体系，复现压气储能地下储气库洞室群实际受力环境。</w:t>
+      </w:r>
+    </w:p>
+    <w:p>
+      <w:pPr>
+        <w:keepNext w:val="0"/>
+        <w:keepLines/>
+        <w:spacing w:after="3" w:line="230" w:lineRule="auto"/>
+        <w:ind w:left="950" w:right="800" w:hanging="150"/>
+      </w:pPr>
+      <w:r>
+        <w:rPr>
+          <w:color w:val="2980B9"/>
+          <w:sz w:val="20"/>
+          <w:szCs w:val="20"/>
+        </w:rPr>
+        <w:t xml:space="preserve">•  </w:t>
+      </w:r>
+      <w:r>
+        <w:rPr>
+          <w:rFonts w:ascii="微软雅黑" w:hAnsi="微软雅黑" w:eastAsia="微软雅黑" w:cs="微软雅黑"/>
+          <w:color w:val="2C3E50"/>
+          <w:sz w:val="20"/>
+          <w:szCs w:val="20"/>
+        </w:rPr>
+        <w:t xml:space="preserve">精准控制分级加压与循环充放压参数（压力路径、加载速率、循环次数），同步监测围岩应力应变传递与裂缝区段损伤演化。</w:t>
+      </w:r>
+    </w:p>
+    <w:p>
+      <w:pPr>
+        <w:keepNext w:val="0"/>
+        <w:keepLines/>
+        <w:spacing w:after="3" w:line="230" w:lineRule="auto"/>
+        <w:ind w:left="950" w:right="800" w:hanging="150"/>
+      </w:pPr>
+      <w:r>
+        <w:rPr>
+          <w:color w:val="2980B9"/>
+          <w:sz w:val="20"/>
+          <w:szCs w:val="20"/>
+        </w:rPr>
+        <w:t xml:space="preserve">•  </w:t>
+      </w:r>
+      <w:r>
+        <w:rPr>
+          <w:rFonts w:ascii="微软雅黑" w:hAnsi="微软雅黑" w:eastAsia="微软雅黑" w:cs="微软雅黑"/>
+          <w:color w:val="2C3E50"/>
+          <w:sz w:val="20"/>
+          <w:szCs w:val="20"/>
+        </w:rPr>
+        <w:t xml:space="preserve">揭示多尺度洞室与裂缝构型对围岩响应的作用规律，为储气库洞室群稳定性评价与运行参数优化提供依据。</w:t>
+      </w:r>
+    </w:p>
+    <w:p>
+      <w:pPr>
+        <w:keepNext/>
+        <w:tabs>
+          <w:tab w:val="right" w:pos="10306"/>
+        </w:tabs>
+        <w:spacing w:before="34" w:after="16" w:line="230" w:lineRule="auto"/>
+        <w:ind w:left="800" w:right="800"/>
+      </w:pPr>
+      <w:r>
+        <w:rPr>
+          <w:rFonts w:ascii="微软雅黑" w:hAnsi="微软雅黑" w:eastAsia="微软雅黑" w:cs="微软雅黑"/>
+          <w:b/>
+          <w:bCs/>
+          <w:color w:val="1A2636"/>
+          <w:sz w:val="22"/>
+          <w:szCs w:val="22"/>
+        </w:rPr>
+        <w:t xml:space="preserve">废弃矿硐压缩空气储库稳定与气密性能研究与可靠性评价</w:t>
+      </w:r>
+      <w:r>
+        <w:rPr>
+          <w:rFonts w:ascii="微软雅黑" w:hAnsi="微软雅黑" w:eastAsia="微软雅黑" w:cs="微软雅黑"/>
+          <w:color w:val="2980B9"/>
+          <w:sz w:val="20"/>
+          <w:szCs w:val="20"/>
+        </w:rPr>
+        <w:t xml:space="preserve">  技术骨干</w:t>
+      </w:r>
+      <w:r>
+        <w:rPr>
+          <w:rFonts w:ascii="微软雅黑" w:hAnsi="微软雅黑" w:eastAsia="微软雅黑" w:cs="微软雅黑"/>
+          <w:color w:val="6B8599"/>
+          <w:sz w:val="16"/>
+          <w:szCs w:val="16"/>
+        </w:rPr>
+        <w:tab/>
+      </w:r>
+      <w:r>
+        <w:rPr>
+          <w:rFonts w:ascii="微软雅黑" w:hAnsi="微软雅黑" w:eastAsia="微软雅黑" w:cs="微软雅黑"/>
+          <w:color w:val="6B8599"/>
+          <w:sz w:val="16"/>
+          <w:szCs w:val="16"/>
+        </w:rPr>
+        <w:t xml:space="preserve">2025.06–2026.04</w:t>
+      </w:r>
+    </w:p>
+    <w:p>
+      <w:pPr>
+        <w:keepNext w:val="0"/>
+        <w:keepLines/>
+        <w:spacing w:after="3" w:line="230" w:lineRule="auto"/>
+        <w:ind w:left="950" w:right="800" w:hanging="150"/>
+      </w:pPr>
+      <w:r>
+        <w:rPr>
+          <w:color w:val="2980B9"/>
+          <w:sz w:val="20"/>
+          <w:szCs w:val="20"/>
+        </w:rPr>
+        <w:t xml:space="preserve">•  </w:t>
+      </w:r>
+      <w:r>
+        <w:rPr>
+          <w:rFonts w:ascii="微软雅黑" w:hAnsi="微软雅黑" w:eastAsia="微软雅黑" w:cs="微软雅黑"/>
+          <w:color w:val="2C3E50"/>
+          <w:sz w:val="20"/>
+          <w:szCs w:val="20"/>
+        </w:rPr>
+        <w:t xml:space="preserve">国家自然科学基金区域创新发展联合基金项目；参与搭建储气库围岩劣化大型物理模型试验平台。</w:t>
+      </w:r>
+    </w:p>
+    <w:p>
+      <w:pPr>
+        <w:keepNext w:val="0"/>
+        <w:keepLines/>
+        <w:spacing w:after="3" w:line="230" w:lineRule="auto"/>
+        <w:ind w:left="950" w:right="800" w:hanging="150"/>
+      </w:pPr>
+      <w:r>
+        <w:rPr>
+          <w:color w:val="2980B9"/>
+          <w:sz w:val="20"/>
+          <w:szCs w:val="20"/>
+        </w:rPr>
+        <w:t xml:space="preserve">•  </w:t>
+      </w:r>
+      <w:r>
+        <w:rPr>
+          <w:rFonts w:ascii="微软雅黑" w:hAnsi="微软雅黑" w:eastAsia="微软雅黑" w:cs="微软雅黑"/>
+          <w:color w:val="2C3E50"/>
+          <w:sz w:val="20"/>
+          <w:szCs w:val="20"/>
+        </w:rPr>
+        <w:t xml:space="preserve">精准控制交变荷载参数（幅值、频率、循环次数）与加载速率，同步监测围岩力学响应与损伤演化。</w:t>
+      </w:r>
+    </w:p>
+    <w:p>
+      <w:pPr>
+        <w:keepNext w:val="0"/>
+        <w:keepLines/>
+        <w:spacing w:after="3" w:line="230" w:lineRule="auto"/>
+        <w:ind w:left="950" w:right="800" w:hanging="150"/>
+      </w:pPr>
+      <w:r>
+        <w:rPr>
+          <w:color w:val="2980B9"/>
+          <w:sz w:val="20"/>
+          <w:szCs w:val="20"/>
+        </w:rPr>
+        <w:t xml:space="preserve">•  </w:t>
+      </w:r>
+      <w:r>
+        <w:rPr>
+          <w:rFonts w:ascii="微软雅黑" w:hAnsi="微软雅黑" w:eastAsia="微软雅黑" w:cs="微软雅黑"/>
+          <w:color w:val="2C3E50"/>
+          <w:sz w:val="20"/>
+          <w:szCs w:val="20"/>
+        </w:rPr>
+        <w:t xml:space="preserve">探究交变荷载下围岩劣化、疲劳损伤与裂缝分布规律，为储气库实际运行提供技术支持。</w:t>
+      </w:r>
+    </w:p>
+    <w:p>
+      <w:pPr>
+        <w:keepNext/>
+        <w:tabs>
+          <w:tab w:val="right" w:pos="10306"/>
+        </w:tabs>
+        <w:spacing w:before="34" w:after="16" w:line="230" w:lineRule="auto"/>
+        <w:ind w:left="800" w:right="800"/>
+      </w:pPr>
+      <w:r>
+        <w:rPr>
+          <w:rFonts w:ascii="微软雅黑" w:hAnsi="微软雅黑" w:eastAsia="微软雅黑" w:cs="微软雅黑"/>
+          <w:b/>
+          <w:bCs/>
+          <w:color w:val="1A2636"/>
+          <w:sz w:val="22"/>
+          <w:szCs w:val="22"/>
+        </w:rPr>
+        <w:t xml:space="preserve">储气库高内压柔性密封体系防渗性能试验研究</w:t>
+      </w:r>
+      <w:r>
+        <w:rPr>
+          <w:rFonts w:ascii="微软雅黑" w:hAnsi="微软雅黑" w:eastAsia="微软雅黑" w:cs="微软雅黑"/>
+          <w:color w:val="2980B9"/>
+          <w:sz w:val="20"/>
+          <w:szCs w:val="20"/>
+        </w:rPr>
+        <w:t xml:space="preserve">  试验方案编制 / 平台结构设计</w:t>
+      </w:r>
+      <w:r>
+        <w:rPr>
+          <w:rFonts w:ascii="微软雅黑" w:hAnsi="微软雅黑" w:eastAsia="微软雅黑" w:cs="微软雅黑"/>
+          <w:color w:val="6B8599"/>
+          <w:sz w:val="16"/>
+          <w:szCs w:val="16"/>
+        </w:rPr>
+        <w:tab/>
+      </w:r>
+      <w:r>
+        <w:rPr>
+          <w:rFonts w:ascii="微软雅黑" w:hAnsi="微软雅黑" w:eastAsia="微软雅黑" w:cs="微软雅黑"/>
+          <w:color w:val="6B8599"/>
+          <w:sz w:val="16"/>
+          <w:szCs w:val="16"/>
+        </w:rPr>
+        <w:t xml:space="preserve">2026.07–至今</w:t>
+      </w:r>
+    </w:p>
+    <w:p>
+      <w:pPr>
+        <w:keepNext w:val="0"/>
+        <w:keepLines/>
+        <w:spacing w:after="3" w:line="230" w:lineRule="auto"/>
+        <w:ind w:left="950" w:right="800" w:hanging="150"/>
+      </w:pPr>
+      <w:r>
+        <w:rPr>
+          <w:color w:val="2980B9"/>
+          <w:sz w:val="20"/>
+          <w:szCs w:val="20"/>
+        </w:rPr>
+        <w:t xml:space="preserve">•  </w:t>
+      </w:r>
+      <w:r>
+        <w:rPr>
+          <w:rFonts w:ascii="微软雅黑" w:hAnsi="微软雅黑" w:eastAsia="微软雅黑" w:cs="微软雅黑"/>
+          <w:color w:val="2C3E50"/>
+          <w:sz w:val="20"/>
+          <w:szCs w:val="20"/>
+        </w:rPr>
+        <w:t xml:space="preserve">面向中国电建集团成都勘测设计研究院有限公司（成勘院）储气库密封需求，编制 20 MPa 高内压柔性密封材料防渗性能试验方案。</w:t>
+      </w:r>
+    </w:p>
+    <w:p>
+      <w:pPr>
+        <w:keepNext w:val="0"/>
+        <w:keepLines/>
+        <w:spacing w:after="3" w:line="230" w:lineRule="auto"/>
+        <w:ind w:left="950" w:right="800" w:hanging="150"/>
+      </w:pPr>
+      <w:r>
+        <w:rPr>
+          <w:color w:val="2980B9"/>
+          <w:sz w:val="20"/>
+          <w:szCs w:val="20"/>
+        </w:rPr>
+        <w:t xml:space="preserve">•  </w:t>
+      </w:r>
+      <w:r>
+        <w:rPr>
+          <w:rFonts w:ascii="微软雅黑" w:hAnsi="微软雅黑" w:eastAsia="微软雅黑" w:cs="微软雅黑"/>
+          <w:color w:val="2C3E50"/>
+          <w:sz w:val="20"/>
+          <w:szCs w:val="20"/>
+        </w:rPr>
+        <w:t xml:space="preserve">设计“柔性密封水囊—聚氨酯填充—钢制反力筒”试验平台，完成 500 mm 内径反力筒结构计算与承压边界校核。</w:t>
+      </w:r>
+    </w:p>
+    <w:p>
+      <w:pPr>
+        <w:keepNext w:val="0"/>
+        <w:keepLines/>
+        <w:spacing w:after="3" w:line="230" w:lineRule="auto"/>
+        <w:ind w:left="950" w:right="800" w:hanging="150"/>
+      </w:pPr>
+      <w:r>
+        <w:rPr>
+          <w:color w:val="2980B9"/>
+          <w:sz w:val="20"/>
+          <w:szCs w:val="20"/>
+        </w:rPr>
+        <w:t xml:space="preserve">•  </w:t>
+      </w:r>
+      <w:r>
+        <w:rPr>
+          <w:rFonts w:ascii="微软雅黑" w:hAnsi="微软雅黑" w:eastAsia="微软雅黑" w:cs="微软雅黑"/>
+          <w:color w:val="2C3E50"/>
+          <w:sz w:val="20"/>
+          <w:szCs w:val="20"/>
+        </w:rPr>
+        <w:t xml:space="preserve">制定分级加压（0.5–20 MPa）、恒压保压与循环加载程序，集成压力、湿度与应变多通道监测及超压联锁保护。</w:t>
       </w:r>
     </w:p>
     <w:p>

</xml_diff>